<commit_message>
feat(reportes): reemplazar etiqueta AñoActual en portada de Word
</commit_message>
<xml_diff>
--- a/ControlMareas.App/Resources/Templates/Portada_informe.docx
+++ b/ControlMareas.App/Resources/Templates/Portada_informe.docx
@@ -124,7 +124,27 @@
                                 <w:sz w:val="36"/>
                                 <w:lang w:val="es-MX"/>
                               </w:rPr>
-                              <w:t>AÑO</w:t>
+                              <w:t>{</w:t>
+                            </w:r>
+                            <w:r>
+                              <w:rPr>
+                                <w:rFonts w:ascii="Encode Sans" w:hAnsi="Encode Sans"/>
+                                <w:b/>
+                                <w:color w:val="FFFFFF"/>
+                                <w:sz w:val="36"/>
+                                <w:lang w:val="es-MX"/>
+                              </w:rPr>
+                              <w:t>A</w:t>
+                            </w:r>
+                            <w:r>
+                              <w:rPr>
+                                <w:rFonts w:ascii="Encode Sans" w:hAnsi="Encode Sans"/>
+                                <w:b/>
+                                <w:color w:val="FFFFFF"/>
+                                <w:sz w:val="36"/>
+                                <w:lang w:val="es-MX"/>
+                              </w:rPr>
+                              <w:t>ñoActual}</w:t>
                             </w:r>
                           </w:p>
                         </w:txbxContent>
@@ -172,7 +192,27 @@
                           <w:sz w:val="36"/>
                           <w:lang w:val="es-MX"/>
                         </w:rPr>
-                        <w:t>AÑO</w:t>
+                        <w:t>{</w:t>
+                      </w:r>
+                      <w:r>
+                        <w:rPr>
+                          <w:rFonts w:ascii="Encode Sans" w:hAnsi="Encode Sans"/>
+                          <w:b/>
+                          <w:color w:val="FFFFFF"/>
+                          <w:sz w:val="36"/>
+                          <w:lang w:val="es-MX"/>
+                        </w:rPr>
+                        <w:t>A</w:t>
+                      </w:r>
+                      <w:r>
+                        <w:rPr>
+                          <w:rFonts w:ascii="Encode Sans" w:hAnsi="Encode Sans"/>
+                          <w:b/>
+                          <w:color w:val="FFFFFF"/>
+                          <w:sz w:val="36"/>
+                          <w:lang w:val="es-MX"/>
+                        </w:rPr>
+                        <w:t>ñoActual}</w:t>
                       </w:r>
                     </w:p>
                   </w:txbxContent>
@@ -355,7 +395,7 @@
                                 <w:color w:val="FFFFFF"/>
                                 <w:sz w:val="22"/>
                               </w:rPr>
-                              <w:t>MEC</w:t>
+                              <w:t>MAGYP</w:t>
                             </w:r>
                             <w:r>
                               <w:rPr>
@@ -393,27 +433,7 @@
                                 <w:color w:val="FFFFFF"/>
                                 <w:sz w:val="22"/>
                               </w:rPr>
-                              <w:t>XX/</w:t>
-                            </w:r>
-                            <w:proofErr w:type="spellStart"/>
-                            <w:r>
-                              <w:rPr>
-                                <w:rFonts w:ascii="Encode Sans" w:hAnsi="Encode Sans"/>
-                                <w:i/>
-                                <w:color w:val="FFFFFF"/>
-                                <w:sz w:val="22"/>
-                              </w:rPr>
-                              <w:t>xx</w:t>
-                            </w:r>
-                            <w:proofErr w:type="spellEnd"/>
-                            <w:r>
-                              <w:rPr>
-                                <w:rFonts w:ascii="Encode Sans" w:hAnsi="Encode Sans"/>
-                                <w:i/>
-                                <w:color w:val="FFFFFF"/>
-                                <w:sz w:val="22"/>
-                              </w:rPr>
-                              <w:t>/20</w:t>
+                              <w:t>XX/xx/20</w:t>
                             </w:r>
                             <w:r>
                               <w:rPr>
@@ -502,7 +522,7 @@
                           <w:color w:val="FFFFFF"/>
                           <w:sz w:val="22"/>
                         </w:rPr>
-                        <w:t>MEC</w:t>
+                        <w:t>MAGYP</w:t>
                       </w:r>
                       <w:r>
                         <w:rPr>
@@ -540,27 +560,7 @@
                           <w:color w:val="FFFFFF"/>
                           <w:sz w:val="22"/>
                         </w:rPr>
-                        <w:t>XX/</w:t>
-                      </w:r>
-                      <w:proofErr w:type="spellStart"/>
-                      <w:r>
-                        <w:rPr>
-                          <w:rFonts w:ascii="Encode Sans" w:hAnsi="Encode Sans"/>
-                          <w:i/>
-                          <w:color w:val="FFFFFF"/>
-                          <w:sz w:val="22"/>
-                        </w:rPr>
-                        <w:t>xx</w:t>
-                      </w:r>
-                      <w:proofErr w:type="spellEnd"/>
-                      <w:r>
-                        <w:rPr>
-                          <w:rFonts w:ascii="Encode Sans" w:hAnsi="Encode Sans"/>
-                          <w:i/>
-                          <w:color w:val="FFFFFF"/>
-                          <w:sz w:val="22"/>
-                        </w:rPr>
-                        <w:t>/20</w:t>
+                        <w:t>XX/xx/20</w:t>
                       </w:r>
                       <w:r>
                         <w:rPr>
@@ -1513,43 +1513,7 @@
         <w:sz w:val="18"/>
         <w:szCs w:val="16"/>
       </w:rPr>
-      <w:t>{</w:t>
-    </w:r>
-    <w:proofErr w:type="spellStart"/>
-    <w:r>
-      <w:rPr>
-        <w:bCs/>
-        <w:sz w:val="18"/>
-        <w:szCs w:val="16"/>
-      </w:rPr>
-      <w:t>AñoMarea</w:t>
-    </w:r>
-    <w:proofErr w:type="spellEnd"/>
-    <w:r>
-      <w:rPr>
-        <w:bCs/>
-        <w:sz w:val="18"/>
-        <w:szCs w:val="16"/>
-      </w:rPr>
-      <w:t>}/{</w:t>
-    </w:r>
-    <w:proofErr w:type="spellStart"/>
-    <w:r>
-      <w:rPr>
-        <w:bCs/>
-        <w:sz w:val="18"/>
-        <w:szCs w:val="16"/>
-      </w:rPr>
-      <w:t>NroMarea</w:t>
-    </w:r>
-    <w:proofErr w:type="spellEnd"/>
-    <w:r>
-      <w:rPr>
-        <w:bCs/>
-        <w:sz w:val="18"/>
-        <w:szCs w:val="16"/>
-      </w:rPr>
-      <w:t>}</w:t>
+      <w:t>{AñoMarea}/{NroMarea}</w:t>
     </w:r>
     <w:r>
       <w:rPr>

</xml_diff>